<commit_message>
Update design report docx
Co-Authored-By: Claude Sonnet 5.5 <noreply@anthropic.com>
</commit_message>
<xml_diff>
--- a/PawsConnect_Design_Report.docx
+++ b/PawsConnect_Design_Report.docx
@@ -6,13 +6,8 @@
       <w:pPr>
         <w:pStyle w:val="Title"/>
       </w:pPr>
-      <w:proofErr w:type="spellStart"/>
       <w:r>
-        <w:t>PawsConnect</w:t>
-      </w:r>
-      <w:proofErr w:type="spellEnd"/>
-      <w:r>
-        <w:t>: an AI feature suite for a pet-adoption platform</w:t>
+        <w:t>PawsConnect: an AI feature suite for a pet-adoption platform</w:t>
       </w:r>
     </w:p>
     <w:p>
@@ -29,19 +24,11 @@
       </w:r>
     </w:p>
     <w:p>
-      <w:proofErr w:type="spellStart"/>
       <w:r>
         <w:rPr>
           <w:i/>
         </w:rPr>
-        <w:t>Github</w:t>
-      </w:r>
-      <w:proofErr w:type="spellEnd"/>
-      <w:r>
-        <w:rPr>
-          <w:i/>
-        </w:rPr>
-        <w:t xml:space="preserve"> </w:t>
+        <w:t xml:space="preserve">Github </w:t>
       </w:r>
       <w:r>
         <w:rPr>
@@ -107,26 +94,13 @@
         <w:t>Scenario.</w:t>
       </w:r>
       <w:r>
-        <w:t xml:space="preserve"> </w:t>
-      </w:r>
-      <w:proofErr w:type="spellStart"/>
-      <w:r>
-        <w:t>PawsConnect</w:t>
-      </w:r>
-      <w:proofErr w:type="spellEnd"/>
-      <w:r>
-        <w:t xml:space="preserve"> is a two-sided platform that connects animal shelters with adopters. Shelter staff photograph animals quickly but rarely have time to write an honest profile for each one, adopters send the same questions </w:t>
-      </w:r>
-      <w:proofErr w:type="gramStart"/>
-      <w:r>
-        <w:t>over and over</w:t>
-      </w:r>
-      <w:proofErr w:type="gramEnd"/>
-      <w:r>
-        <w:t>, and a good match can still fail quietly in the first weeks after the animal goes home. I played the first AI engineer and built five features, each for one named person with a human making the final call. Because welfare is at stake, the interface shows uncertainty instead of hi</w:t>
+        <w:t xml:space="preserve"> PawsConnect is a two-sided platform </w:t>
       </w:r>
       <w:r>
-        <w:t>ding it.</w:t>
+        <w:t>which</w:t>
+      </w:r>
+      <w:r>
+        <w:t xml:space="preserve"> connects animal shelters with adopters. Shelter staff photograph animals quickly but rarely have time to write an honest profile for each one, adopters send the same questions over and over, and a good match can still fail quietly in the first weeks after the animal goes home. I played the first AI engineer and built five features, each for one named person with a human making the final call. Because welfare is at stake, the interface shows uncertainty instead of hiding it.</w:t>
       </w:r>
     </w:p>
     <w:tbl>
@@ -703,21 +677,7 @@
               <w:rPr>
                 <w:sz w:val="17"/>
               </w:rPr>
-              <w:t xml:space="preserve">Voice and policy live in the prompt; the listing is </w:t>
-            </w:r>
-            <w:proofErr w:type="gramStart"/>
-            <w:r>
-              <w:rPr>
-                <w:sz w:val="17"/>
-              </w:rPr>
-              <w:t>pasted</w:t>
-            </w:r>
-            <w:proofErr w:type="gramEnd"/>
-            <w:r>
-              <w:rPr>
-                <w:sz w:val="17"/>
-              </w:rPr>
-              <w:t xml:space="preserve"> in, so no retrieval index is needed yet.</w:t>
+              <w:t>Voice and policy live in the prompt; the listing is pasted in, so no retrieval index is needed yet.</w:t>
             </w:r>
           </w:p>
         </w:tc>
@@ -785,16 +745,8 @@
               <w:rPr>
                 <w:sz w:val="17"/>
               </w:rPr>
-              <w:t xml:space="preserve">D. </w:t>
+              <w:t>D. PawStay</w:t>
             </w:r>
-            <w:proofErr w:type="spellStart"/>
-            <w:r>
-              <w:rPr>
-                <w:sz w:val="17"/>
-              </w:rPr>
-              <w:t>PawStay</w:t>
-            </w:r>
-            <w:proofErr w:type="spellEnd"/>
           </w:p>
         </w:tc>
         <w:tc>
@@ -825,21 +777,7 @@
               <w:rPr>
                 <w:sz w:val="17"/>
               </w:rPr>
-              <w:t xml:space="preserve">Earlier check-ins fit </w:t>
-            </w:r>
-            <w:proofErr w:type="gramStart"/>
-            <w:r>
-              <w:rPr>
-                <w:sz w:val="17"/>
-              </w:rPr>
-              <w:t>in</w:t>
-            </w:r>
-            <w:proofErr w:type="gramEnd"/>
-            <w:r>
-              <w:rPr>
-                <w:sz w:val="17"/>
-              </w:rPr>
-              <w:t xml:space="preserve"> the prompt, so no retrieval; a labelled set makes the safety claim measurable.</w:t>
+              <w:t>Earlier check-ins fit in the prompt, so no retrieval; a labelled set makes the safety claim measurable.</w:t>
             </w:r>
           </w:p>
         </w:tc>
@@ -896,32 +834,14 @@
         <w:t>B. Photo to profile.</w:t>
       </w:r>
       <w:r>
-        <w:t xml:space="preserve"> The prompt requests </w:t>
+        <w:t xml:space="preserve"> The prompt requests structured JSON: names, species, breed guess with a high/medium/low confidence label, an age range, a hedged personality text, care needs and a fee tier. Fee tiers depend on age only (never breed), and an unknown or low-confidence age falls to "staff to set". Following the Chapter 2 chart pattern, the model must say "not determinable" when a field cannot be extracted, and a breed may never be "high" unless unmistakable. The </w:t>
       </w:r>
-      <w:proofErr w:type="gramStart"/>
-      <w:r>
-        <w:t>structured</w:t>
-      </w:r>
-      <w:proofErr w:type="gramEnd"/>
-      <w:r>
-        <w:t xml:space="preserve"> JSON: names, species, breed guess with a high/medium/low confidence label, an age range, a hedged personality text, care needs and a fee tier. Fee </w:t>
-      </w:r>
-      <w:proofErr w:type="gramStart"/>
-      <w:r>
-        <w:t>tiers</w:t>
-      </w:r>
-      <w:proofErr w:type="gramEnd"/>
-      <w:r>
-        <w:t xml:space="preserve"> depend on age only (never breed), and an unknown or low-confidence age falls to "staff to set". Following the Chapter 2 chart pattern, the model must say "not determinable" when a field cannot be extracted, and a breed may never be "high" unless unmistakable. The </w:t>
-      </w:r>
-      <w:proofErr w:type="spellStart"/>
       <w:r>
         <w:rPr>
           <w:rFonts w:ascii="Consolas" w:eastAsia="Consolas" w:hAnsi="Consolas"/>
         </w:rPr>
         <w:t>human_review</w:t>
       </w:r>
-      <w:proofErr w:type="spellEnd"/>
       <w:r>
         <w:t xml:space="preserve"> flag is set in code whenever any confidence is low, the photo is poor, or there is not exactly one animal.</w:t>
       </w:r>
@@ -940,15 +860,7 @@
         <w:t>Result:</w:t>
       </w:r>
       <w:r>
-        <w:t xml:space="preserve"> my first version flagged all eight photos, even clear ones, because the model listed medium-confidence fields as "uncertain"; moving the flag into code gave five of eight, with the hard cases handled as intended. A repeatability test (five photos, three runs each) gave identical breed and age every time (15 of 15), yet the review flag flipped for one dog </w:t>
-      </w:r>
-      <w:proofErr w:type="gramStart"/>
-      <w:r>
-        <w:t>because</w:t>
-      </w:r>
-      <w:proofErr w:type="gramEnd"/>
-      <w:r>
-        <w:t xml:space="preserve"> its personality confidence changed. </w:t>
+        <w:t xml:space="preserve"> my first version flagged all eight photos, even clear ones, because the model listed medium-confidence fields as "uncertain"; moving the flag into code gave five of eight, with the hard cases handled as intended. A repeatability test (five photos, three runs each) gave identical breed and age every time (15 of 15), yet the review flag flipped for one dog because its personality confidence changed. </w:t>
       </w:r>
       <w:r>
         <w:rPr>
@@ -971,15 +883,7 @@
         <w:t>Bonus banner.</w:t>
       </w:r>
       <w:r>
-        <w:t xml:space="preserve"> To mirror </w:t>
-      </w:r>
-      <w:proofErr w:type="gramStart"/>
-      <w:r>
-        <w:t>Shopify Magic</w:t>
-      </w:r>
-      <w:proofErr w:type="gramEnd"/>
-      <w:r>
-        <w:t xml:space="preserve"> I generated a banner for Cocoa with OpenAI's </w:t>
+        <w:t xml:space="preserve"> To mirror Shopify Magic I generated a banner for Cocoa with OpenAI's </w:t>
       </w:r>
       <w:r>
         <w:rPr>
@@ -988,15 +892,7 @@
         <w:t>gpt-image-1</w:t>
       </w:r>
       <w:r>
-        <w:t xml:space="preserve"> from her CC0 photo (an outside tool; the course labs use Stable Diffusion). The exact prompt is in Appendix B. The first attempt worked: correct text and no </w:t>
-      </w:r>
-      <w:proofErr w:type="spellStart"/>
-      <w:r>
-        <w:t>behaviour</w:t>
-      </w:r>
-      <w:proofErr w:type="spellEnd"/>
-      <w:r>
-        <w:t xml:space="preserve"> claims. The app labels it AI-generated and requires staff approval before posting.</w:t>
+        <w:t xml:space="preserve"> from her CC0 photo (an outside tool; the course labs use Stable Diffusion). The exact prompt is in Appendix B. The first attempt worked: correct text and no behaviour claims. The app labels it AI-generated and requires staff approval before posting.</w:t>
       </w:r>
     </w:p>
     <w:p>
@@ -1036,15 +932,7 @@
         <w:t>Interpretation:</w:t>
       </w:r>
       <w:r>
-        <w:t xml:space="preserve"> a rule written for one failure leaks into its </w:t>
-      </w:r>
-      <w:proofErr w:type="spellStart"/>
-      <w:r>
-        <w:t>neighbours</w:t>
-      </w:r>
-      <w:proofErr w:type="spellEnd"/>
-      <w:r>
-        <w:t>, so every prompt change needs a rerun of the whole set.</w:t>
+        <w:t xml:space="preserve"> a rule written for one failure leaks into its neighbours, so every prompt change needs a rerun of the whole set.</w:t>
       </w:r>
     </w:p>
     <w:p>
@@ -1081,23 +969,7 @@
         <w:t>Interpretation:</w:t>
       </w:r>
       <w:r>
-        <w:t xml:space="preserve"> the judge itself needed guarding. It first failed the wrong check, later invented violations, so a </w:t>
-      </w:r>
-      <w:proofErr w:type="gramStart"/>
-      <w:r>
-        <w:t>fail</w:t>
-      </w:r>
-      <w:proofErr w:type="gramEnd"/>
-      <w:r>
-        <w:t xml:space="preserve"> now counts only if it quotes words that appear in the draft and </w:t>
-      </w:r>
-      <w:proofErr w:type="gramStart"/>
-      <w:r>
-        <w:t>match</w:t>
-      </w:r>
-      <w:proofErr w:type="gramEnd"/>
-      <w:r>
-        <w:t xml:space="preserve"> a short policy list.</w:t>
+        <w:t xml:space="preserve"> the judge itself needed guarding. It first failed the wrong check, later invented violations, so a fail now counts only if it quotes words that appear in the draft and match a short policy list.</w:t>
       </w:r>
     </w:p>
     <w:p>
@@ -1163,23 +1035,7 @@
         <w:spacing w:after="100"/>
       </w:pPr>
       <w:r>
-        <w:t xml:space="preserve">Pepper's Day 3 check-in said only "She's </w:t>
-      </w:r>
-      <w:proofErr w:type="gramStart"/>
-      <w:r>
-        <w:t>fine</w:t>
-      </w:r>
-      <w:proofErr w:type="gramEnd"/>
-      <w:r>
-        <w:t xml:space="preserve"> I guess. Different than I expected," and Day 7 said "Still hiding most of the day, but she does come out at night." </w:t>
-      </w:r>
-      <w:proofErr w:type="spellStart"/>
-      <w:r>
-        <w:t>PawStay</w:t>
-      </w:r>
-      <w:proofErr w:type="spellEnd"/>
-      <w:r>
-        <w:t xml:space="preserve"> labelled the trend </w:t>
+        <w:t xml:space="preserve">Pepper's Day 3 check-in said only "She's fine I guess. Different than I expected," and Day 7 said "Still hiding most of the day, but she does come out at night." PawStay labelled the trend </w:t>
       </w:r>
       <w:r>
         <w:rPr>
@@ -1217,16 +1073,8 @@
         <w:rPr>
           <w:b w:val="0"/>
         </w:rPr>
-        <w:t xml:space="preserve">4. Innovation feature: </w:t>
+        <w:t>4. Innovation feature: PawStay</w:t>
       </w:r>
-      <w:proofErr w:type="spellStart"/>
-      <w:r>
-        <w:rPr>
-          <w:b w:val="0"/>
-        </w:rPr>
-        <w:t>PawStay</w:t>
-      </w:r>
-      <w:proofErr w:type="spellEnd"/>
     </w:p>
     <w:p>
       <w:pPr>
@@ -1239,26 +1087,7 @@
         <w:t>Stakeholder and decision.</w:t>
       </w:r>
       <w:r>
-        <w:t xml:space="preserve"> Post-adoption coordinators decide, for every Day 1, 3, 7, 14 and 30 </w:t>
-      </w:r>
-      <w:proofErr w:type="gramStart"/>
-      <w:r>
-        <w:t>check-in</w:t>
-      </w:r>
-      <w:proofErr w:type="gramEnd"/>
-      <w:r>
-        <w:t xml:space="preserve">, who needs a call today and who can wait. </w:t>
-      </w:r>
-      <w:proofErr w:type="spellStart"/>
-      <w:r>
-        <w:t>PawStay</w:t>
-      </w:r>
-      <w:proofErr w:type="spellEnd"/>
-      <w:r>
-        <w:t xml:space="preserve"> reads each reply together with the earlier ones, labels the placement Stable, Needs Attention or Urgent Human Follow-up, names the concern and trend (Improving, Stable, Worsening, New concern), quotes the adopter's words as evidence, and routes it to the right team. Reading the history is the point: Rocky's growl at a child on Day 3 became "Improving" by Day 7 instead of being judg</w:t>
-      </w:r>
-      <w:r>
-        <w:t>ed alone.</w:t>
+        <w:t xml:space="preserve"> Post-adoption coordinators decide, for every Day 1, 3, 7, 14 and 30 check-in, who needs a call today and who can wait. PawStay reads each reply together with the earlier ones, labels the placement Stable, Needs Attention or Urgent Human Follow-up, names the concern and trend (Improving, Stable, Worsening, New concern), quotes the adopter's words as evidence, and routes it to the right team. Reading the history is the point: Rocky's growl at a child on Day 3 became "Improving" by Day 7 instead of being judged alone.</w:t>
       </w:r>
     </w:p>
     <w:p>
@@ -1272,15 +1101,7 @@
         <w:t>Results.</w:t>
       </w:r>
       <w:r>
-        <w:t xml:space="preserve"> On 28 synthetic check-ins from nine placements, the final version got </w:t>
-      </w:r>
-      <w:proofErr w:type="gramStart"/>
-      <w:r>
-        <w:t>status right</w:t>
-      </w:r>
-      <w:proofErr w:type="gramEnd"/>
-      <w:r>
-        <w:t xml:space="preserve"> 28 of 28 and trend right 26 of 28, escalated all four urgent cases, and raised no false alarms on 12 clearly stable check-ins; the release gate passes. The first version scored 71% status accuracy with 67% false alarms because its judge failed 24 of 28 check-ins. A stress test shows the judge catching a deliberately bad assessment. </w:t>
+        <w:t xml:space="preserve"> On 28 synthetic check-ins from nine placements, the final version got status right 28 of 28 and trend right 26 of 28, escalated all four urgent cases, and raised no false alarms on 12 clearly stable check-ins; the release gate passes. The first version scored 71% status accuracy with 67% false alarms because its judge failed 24 of 28 check-ins. A stress test shows the judge catching a deliberately bad assessment. </w:t>
       </w:r>
       <w:r>
         <w:rPr>
@@ -1303,18 +1124,7 @@
         <w:t>What could go wrong, and mitigation.</w:t>
       </w:r>
       <w:r>
-        <w:t xml:space="preserve"> The worst failure is false reassurance: a deteriorating placement labelled Stable, or a cheerful message hiding a symptom. Mitigations: a rule-based safety net that stops risk phrases ending as Stable, routing and escalation enforced in code, and mandatory human review for any non-stable result. The second risk is overreach into diagnosis, care advice or telling adopters to return a pet, which the two-key judge blocks. Impact is measured through four KPIs (30-day return rate, time from concerning check-in </w:t>
-      </w:r>
-      <w:r>
-        <w:t xml:space="preserve">to human contact, share of flagged placements </w:t>
-      </w:r>
-      <w:proofErr w:type="spellStart"/>
-      <w:r>
-        <w:t>stabilised</w:t>
-      </w:r>
-      <w:proofErr w:type="spellEnd"/>
-      <w:r>
-        <w:t>, share of urgent cases escalated) via a logged event trail; only the last is measured here, and the others use clearly labelled synthetic seed events.</w:t>
+        <w:t xml:space="preserve"> The worst failure is false reassurance: a deteriorating placement labelled Stable, or a cheerful message hiding a symptom. Mitigations: a rule-based safety net that stops risk phrases ending as Stable, routing and escalation enforced in code, and mandatory human review for any non-stable result. The second risk is overreach into diagnosis, care advice or telling adopters to return a pet, which the two-key judge blocks. Impact is measured through four KPIs (30-day return rate, time from concerning check-in to human contact, share of flagged placements stabilised, share of urgent cases escalated) via a logged event trail; only the last is measured here, and the others use clearly labelled synthetic seed events.</w:t>
       </w:r>
     </w:p>
     <w:p>
@@ -1333,23 +1143,7 @@
         <w:spacing w:after="100"/>
       </w:pPr>
       <w:r>
-        <w:t xml:space="preserve">Breed labels can bias adopters and fees, so tiers use age only and breed appears as an uncertain "-type mix" with its evidence. Listing copy is told to hedge and never claim </w:t>
-      </w:r>
-      <w:proofErr w:type="spellStart"/>
-      <w:r>
-        <w:t>behaviour</w:t>
-      </w:r>
-      <w:proofErr w:type="spellEnd"/>
-      <w:r>
-        <w:t xml:space="preserve"> the photo cannot show, to avoid emotionally manipulative or false descriptions. The platform should never automate adoption approval, return or rehoming decisions, medical triage or welfare judgments, and </w:t>
-      </w:r>
-      <w:proofErr w:type="spellStart"/>
-      <w:r>
-        <w:t>PawStay</w:t>
-      </w:r>
-      <w:proofErr w:type="spellEnd"/>
-      <w:r>
-        <w:t xml:space="preserve"> must support coordinators rather than pressure adopters.</w:t>
+        <w:t>Breed labels can bias adopters and fees, so tiers use age only and breed appears as an uncertain "-type mix" with its evidence. Listing copy is told to hedge and never claim behaviour the photo cannot show, to avoid emotionally manipulative or false descriptions. The platform should never automate adoption approval, return or rehoming decisions, medical triage or welfare judgments, and PawStay must support coordinators rather than pressure adopters.</w:t>
       </w:r>
     </w:p>
     <w:p>
@@ -1390,38 +1184,14 @@
         <w:t>My role.</w:t>
       </w:r>
       <w:r>
-        <w:t xml:space="preserve"> I defined the project direction and requirements, selected the </w:t>
-      </w:r>
-      <w:proofErr w:type="spellStart"/>
-      <w:r>
-        <w:t>PawStay</w:t>
-      </w:r>
-      <w:proofErr w:type="spellEnd"/>
-      <w:r>
-        <w:t xml:space="preserve"> innovation feature, and specified its behavior, KPIs, and limitations. I </w:t>
+        <w:t xml:space="preserve"> I defined the project direction and requirements, selected the PawStay innovation feature, and specified its behavior, KPIs, and limitations. I </w:t>
       </w:r>
       <w:r>
         <w:rPr>
           <w:b/>
           <w:bCs/>
         </w:rPr>
-        <w:t xml:space="preserve">personally coded and assembled the </w:t>
-      </w:r>
-      <w:proofErr w:type="spellStart"/>
-      <w:r>
-        <w:rPr>
-          <w:b/>
-          <w:bCs/>
-        </w:rPr>
-        <w:t>Streamlit</w:t>
-      </w:r>
-      <w:proofErr w:type="spellEnd"/>
-      <w:r>
-        <w:rPr>
-          <w:b/>
-          <w:bCs/>
-        </w:rPr>
-        <w:t xml:space="preserve"> application</w:t>
+        <w:t>personally coded and assembled the Streamlit application</w:t>
       </w:r>
       <w:r>
         <w:t xml:space="preserve"> so I could understand the implementation, maintain control over the functionality, and explain the code myself. I reviewed AI-generated suggestions, </w:t>
@@ -1453,15 +1223,7 @@
         <w:t>What Claude did.</w:t>
       </w:r>
       <w:r>
-        <w:t xml:space="preserve"> Claude Code assisted with code suggestions, troubleshooting, prompt refinement, synthetic test data, and drafting parts of the report. I reviewed and modified </w:t>
-      </w:r>
-      <w:proofErr w:type="gramStart"/>
-      <w:r>
-        <w:t>its</w:t>
-      </w:r>
-      <w:proofErr w:type="gramEnd"/>
-      <w:r>
-        <w:t xml:space="preserve"> outputs before using them.</w:t>
+        <w:t xml:space="preserve"> Claude Code assisted with code suggestions, troubleshooting, prompt refinement, synthetic test data, and drafting parts of the report. I reviewed and modified its outputs before using them.</w:t>
       </w:r>
     </w:p>
     <w:p>
@@ -1476,23 +1238,7 @@
         <w:t>Verification.</w:t>
       </w:r>
       <w:r>
-        <w:t xml:space="preserve"> I tested the app using all bundled inputs, reviewed failures, refined prompts, and verified reported results against the logs. Both </w:t>
-      </w:r>
-      <w:proofErr w:type="gramStart"/>
-      <w:r>
-        <w:t>cached</w:t>
-      </w:r>
-      <w:proofErr w:type="gramEnd"/>
-      <w:r>
-        <w:t xml:space="preserve"> and live modes were tested. Test photos are CC0 images from Wikimedia Commons; all other test data </w:t>
-      </w:r>
-      <w:proofErr w:type="gramStart"/>
-      <w:r>
-        <w:t>is</w:t>
-      </w:r>
-      <w:proofErr w:type="gramEnd"/>
-      <w:r>
-        <w:t xml:space="preserve"> synthetic.</w:t>
+        <w:t xml:space="preserve"> I tested the app using all bundled inputs, reviewed failures, refined prompts, and verified reported results against the logs. Both cached and live modes were tested. Test photos are CC0 images from Wikimedia Commons; all other test data is synthetic.</w:t>
       </w:r>
     </w:p>
     <w:p>
@@ -1545,23 +1291,7 @@
         <w:t>OPENAI_API_KEY</w:t>
       </w:r>
       <w:r>
-        <w:t xml:space="preserve"> environment variable. The sidebar shows the live API call count and </w:t>
-      </w:r>
-      <w:proofErr w:type="gramStart"/>
-      <w:r>
-        <w:t>estimated</w:t>
-      </w:r>
-      <w:proofErr w:type="gramEnd"/>
-      <w:r>
-        <w:t xml:space="preserve"> cost for the session </w:t>
-      </w:r>
-      <w:proofErr w:type="gramStart"/>
-      <w:r>
-        <w:t>at the moment</w:t>
-      </w:r>
-      <w:proofErr w:type="gramEnd"/>
-      <w:r>
-        <w:t xml:space="preserve"> of capture.</w:t>
+        <w:t xml:space="preserve"> environment variable. The sidebar shows the live API call count and estimated cost for the session at the moment of capture.</w:t>
       </w:r>
     </w:p>
     <w:p>
@@ -1622,21 +1352,7 @@
         <w:rPr>
           <w:sz w:val="17"/>
         </w:rPr>
-        <w:t xml:space="preserve"> The vision model returns "not determinable" for breed and personality, no suggested names, low confidence </w:t>
-      </w:r>
-      <w:proofErr w:type="gramStart"/>
-      <w:r>
-        <w:rPr>
-          <w:sz w:val="17"/>
-        </w:rPr>
-        <w:t>on</w:t>
-      </w:r>
-      <w:proofErr w:type="gramEnd"/>
-      <w:r>
-        <w:rPr>
-          <w:sz w:val="17"/>
-        </w:rPr>
-        <w:t xml:space="preserve"> every field, Tier 0 ("staff to set") and five review reasons. Sidebar: 1 live call, est. $0.0007.</w:t>
+        <w:t xml:space="preserve"> The vision model returns "not determinable" for breed and personality, no suggested names, low confidence on every field, Tier 0 ("staff to set") and five review reasons. Sidebar: 1 live call, est. $0.0007.</w:t>
       </w:r>
     </w:p>
     <w:p>
@@ -1698,21 +1414,7 @@
         <w:rPr>
           <w:sz w:val="17"/>
         </w:rPr>
-        <w:t xml:space="preserve"> With the deliberately weakened persona, draft 1 says "yes, he is available for adoption!". The judge fails the honesty check, quotes the offending words, and the app regenerates once; draft 2 passes and is the </w:t>
-      </w:r>
-      <w:proofErr w:type="gramStart"/>
-      <w:r>
-        <w:rPr>
-          <w:sz w:val="17"/>
-        </w:rPr>
-        <w:t>reply</w:t>
-      </w:r>
-      <w:proofErr w:type="gramEnd"/>
-      <w:r>
-        <w:rPr>
-          <w:sz w:val="17"/>
-        </w:rPr>
-        <w:t xml:space="preserve"> the adopter would see. Sidebar: 5 live calls, est. $0.0012.</w:t>
+        <w:t xml:space="preserve"> With the deliberately weakened persona, draft 1 says "yes, he is available for adoption!". The judge fails the honesty check, quotes the offending words, and the app regenerates once; draft 2 passes and is the reply the adopter would see. Sidebar: 5 live calls, est. $0.0012.</w:t>
       </w:r>
     </w:p>
     <w:p>
@@ -1768,23 +1470,7 @@
           <w:b/>
           <w:sz w:val="17"/>
         </w:rPr>
-        <w:t>Figure A3 - Part D (</w:t>
-      </w:r>
-      <w:proofErr w:type="spellStart"/>
-      <w:r>
-        <w:rPr>
-          <w:b/>
-          <w:sz w:val="17"/>
-        </w:rPr>
-        <w:t>PawStay</w:t>
-      </w:r>
-      <w:proofErr w:type="spellEnd"/>
-      <w:r>
-        <w:rPr>
-          <w:b/>
-          <w:sz w:val="17"/>
-        </w:rPr>
-        <w:t>), live mode, Max's four check-ins.</w:t>
+        <w:t>Figure A3 - Part D (PawStay), live mode, Max's four check-ins.</w:t>
       </w:r>
       <w:r>
         <w:rPr>
@@ -1865,21 +1551,7 @@
         <w:rPr>
           <w:sz w:val="17"/>
         </w:rPr>
-        <w:t xml:space="preserve">, image edit of her CC0 photo) on 2026-10-04. Text is limited to the pet's name and one line, and the prompt forbids </w:t>
-      </w:r>
-      <w:proofErr w:type="spellStart"/>
-      <w:r>
-        <w:rPr>
-          <w:sz w:val="17"/>
-        </w:rPr>
-        <w:t>behaviour</w:t>
-      </w:r>
-      <w:proofErr w:type="spellEnd"/>
-      <w:r>
-        <w:rPr>
-          <w:sz w:val="17"/>
-        </w:rPr>
-        <w:t xml:space="preserve"> claims. In the app it is labelled "AI-generated" and needs staff approval before posting. Tool and prompt: Appendix B.</w:t>
+        <w:t>, image edit of her CC0 photo) on 2026-10-04. Text is limited to the pet's name and one line, and the prompt forbids behaviour claims. In the app it is labelled "AI-generated" and needs staff approval before posting. Tool and prompt: Appendix B.</w:t>
       </w:r>
     </w:p>
     <w:p>
@@ -1934,23 +1606,7 @@
               <w:rPr>
                 <w:sz w:val="17"/>
               </w:rPr>
-              <w:t xml:space="preserve">OpenAI Images API (gpt-image-1, </w:t>
-            </w:r>
-            <w:proofErr w:type="spellStart"/>
-            <w:proofErr w:type="gramStart"/>
-            <w:r>
-              <w:rPr>
-                <w:sz w:val="17"/>
-              </w:rPr>
-              <w:t>images.edit</w:t>
-            </w:r>
-            <w:proofErr w:type="spellEnd"/>
-            <w:proofErr w:type="gramEnd"/>
-            <w:r>
-              <w:rPr>
-                <w:sz w:val="17"/>
-              </w:rPr>
-              <w:t>)</w:t>
+              <w:t>OpenAI Images API (gpt-image-1, images.edit)</w:t>
             </w:r>
           </w:p>
         </w:tc>
@@ -1982,19 +1638,11 @@
             <w:pPr>
               <w:spacing w:after="20"/>
             </w:pPr>
-            <w:proofErr w:type="spellStart"/>
             <w:r>
               <w:rPr>
                 <w:sz w:val="17"/>
               </w:rPr>
-              <w:t>Testing_Images</w:t>
-            </w:r>
-            <w:proofErr w:type="spellEnd"/>
-            <w:r>
-              <w:rPr>
-                <w:sz w:val="17"/>
-              </w:rPr>
-              <w:t>/dog_01.jpg (CC0 photo of the Labrador-type dog listed as Cocoa)</w:t>
+              <w:t>Testing_Images/dog_01.jpg (CC0 photo of the Labrador-type dog listed as Cocoa)</w:t>
             </w:r>
           </w:p>
         </w:tc>
@@ -2066,49 +1714,7 @@
               <w:rPr>
                 <w:sz w:val="17"/>
               </w:rPr>
-              <w:t xml:space="preserve">Create a warm, friendly adoption banner in a clean flat-illustration style for a shelter dog named Cocoa. Use the provided photo for the dog's look: a chocolate-brown Labrador-type dog looking up with an open, happy mouth. Landscape layout with the dog on the left and open space on the right. Soft warm </w:t>
-            </w:r>
-            <w:proofErr w:type="spellStart"/>
-            <w:r>
-              <w:rPr>
-                <w:sz w:val="17"/>
-              </w:rPr>
-              <w:t>colours</w:t>
-            </w:r>
-            <w:proofErr w:type="spellEnd"/>
-            <w:r>
-              <w:rPr>
-                <w:sz w:val="17"/>
-              </w:rPr>
-              <w:t xml:space="preserve"> (cream, terracotta, sage green), a few subtle paw-print shapes, a simple park background. Headline text exactly: 'Meet Cocoa'. Smaller line exactly: 'Adopt me through </w:t>
-            </w:r>
-            <w:proofErr w:type="spellStart"/>
-            <w:r>
-              <w:rPr>
-                <w:sz w:val="17"/>
-              </w:rPr>
-              <w:t>PawsConnect</w:t>
-            </w:r>
-            <w:proofErr w:type="spellEnd"/>
-            <w:r>
-              <w:rPr>
-                <w:sz w:val="17"/>
-              </w:rPr>
-              <w:t xml:space="preserve">'. Spell the text exactly as given and add no other words. Do not add any other animals or people, and do not make any claims about the dog's </w:t>
-            </w:r>
-            <w:proofErr w:type="spellStart"/>
-            <w:r>
-              <w:rPr>
-                <w:sz w:val="17"/>
-              </w:rPr>
-              <w:t>behaviour</w:t>
-            </w:r>
-            <w:proofErr w:type="spellEnd"/>
-            <w:r>
-              <w:rPr>
-                <w:sz w:val="17"/>
-              </w:rPr>
-              <w:t>.</w:t>
+              <w:t>Create a warm, friendly adoption banner in a clean flat-illustration style for a shelter dog named Cocoa. Use the provided photo for the dog's look: a chocolate-brown Labrador-type dog looking up with an open, happy mouth. Landscape layout with the dog on the left and open space on the right. Soft warm colours (cream, terracotta, sage green), a few subtle paw-print shapes, a simple park background. Headline text exactly: 'Meet Cocoa'. Smaller line exactly: 'Adopt me through PawsConnect'. Spell the text exactly as given and add no other words. Do not add any other animals or people, and do not make any claims about the dog's behaviour.</w:t>
             </w:r>
           </w:p>
         </w:tc>
@@ -2198,19 +1804,11 @@
       <w:pStyle w:val="Footer"/>
       <w:jc w:val="center"/>
     </w:pPr>
-    <w:proofErr w:type="spellStart"/>
     <w:r>
       <w:rPr>
         <w:sz w:val="16"/>
       </w:rPr>
-      <w:t>PawsConnect</w:t>
-    </w:r>
-    <w:proofErr w:type="spellEnd"/>
-    <w:r>
-      <w:rPr>
-        <w:sz w:val="16"/>
-      </w:rPr>
-      <w:t xml:space="preserve"> design report - page </w:t>
+      <w:t xml:space="preserve">PawsConnect design report - page </w:t>
     </w:r>
     <w:r>
       <w:rPr>

</xml_diff>